<commit_message>
Correct weighing system reference to Optiweigh
Co-authored-by: e4bhanu <e4bhanu@users.noreply.github.com>
</commit_message>
<xml_diff>
--- a/proposals/DIT_AgTech_Cattle_Weight_Estimation_Proposal.docx
+++ b/proposals/DIT_AgTech_Cattle_Weight_Estimation_Proposal.docx
@@ -194,7 +194,7 @@
         <w:spacing w:after="80" w:before="0"/>
       </w:pPr>
       <w:r>
-        <w:t>DIT AgTech has indicated that the liveweight data will be collected using the Agscent Air system integrated with Optiweigh automatic weighing technology. The Agscent Air product information describes an integrated methane and liveweight system that captures individual animal ID, methane and CO2 readings, and liveweight data automatically. DIT AgTech has advised that the expected liveweight accuracy of this weighing reference is approximately 95-97%. The AI model's accuracy must therefore be interpreted relative to the accuracy and uncertainty of that reference data, not as an absolute measurement beyond the precision of the weighing system itself.</w:t>
+        <w:t>DIT AgTech has indicated that the liveweight data will be collected using Optiweigh automatic weighing technology. Optiweigh describes its system as a portable, self-contained livestock weighing unit that can be placed in a paddock or feedlot, records animal EID and front-foot weight when cattle step onto the platform, and sends the data to the cloud where algorithms calculate whole-body liveweight. DIT AgTech has advised that the expected liveweight accuracy of this weighing reference is approximately 95-97%. The AI model's accuracy must therefore be interpreted relative to the accuracy and uncertainty of that reference data, not as an absolute measurement beyond the precision of the weighing system itself.</w:t>
       </w:r>
     </w:p>
     <w:p>
@@ -238,7 +238,7 @@
         <w:spacing w:after="30" w:before="0"/>
       </w:pPr>
       <w:r>
-        <w:t>A structured protocol for pairing cattle images or short video snippets with Agscent Air/Optiweigh reference liveweight readings.</w:t>
+        <w:t>A structured protocol for pairing cattle images or short video snippets with Optiweigh reference liveweight readings.</w:t>
       </w:r>
     </w:p>
     <w:p>
@@ -274,7 +274,7 @@
         <w:spacing w:after="30" w:before="0"/>
       </w:pPr>
       <w:r>
-        <w:t>A performance evaluation report covering model error relative to the Agscent Air/Optiweigh liveweight reference, repeatability, subgroup bias, robustness to field conditions, and progress against the agreed target accuracy framework.</w:t>
+        <w:t>A performance evaluation report covering model error relative to the Optiweigh liveweight reference, repeatability, subgroup bias, robustness to field conditions, and progress against the agreed target accuracy framework.</w:t>
       </w:r>
     </w:p>
     <w:p>
@@ -326,7 +326,7 @@
         <w:spacing w:after="80" w:before="0"/>
       </w:pPr>
       <w:r>
-        <w:t>The proposed system is built around supervised learning from paired visual observations and reference liveweight data. Each training example should represent a known animal observation at or near a drink station, with synchronised camera data and a corresponding liveweight record from the Agscent Air/Optiweigh system or other confirmed DIT AgTech weighing reference.</w:t>
+        <w:t>The proposed system is built around supervised learning from paired visual observations and reference liveweight data. Each training example should represent a known animal observation at or near a drink station, with synchronised camera data and a corresponding liveweight record from the Optiweigh system or other confirmed DIT AgTech weighing reference.</w:t>
       </w:r>
     </w:p>
     <w:p>
@@ -819,7 +819,7 @@
         <w:spacing w:after="30" w:before="0"/>
       </w:pPr>
       <w:r>
-        <w:t>Reference liveweight from the Agscent Air/Optiweigh system.</w:t>
+        <w:t>Reference liveweight from the Optiweigh system.</w:t>
       </w:r>
     </w:p>
     <w:p>
@@ -1002,7 +1002,7 @@
         <w:spacing w:after="80" w:before="0"/>
       </w:pPr>
       <w:r>
-        <w:t>The Agscent Air/Optiweigh liveweight record will be treated as the reference label for model training. However, the dataset still requires quality assurance. Swinburne will define rules for accepting or rejecting observations, including:</w:t>
+        <w:t>The Optiweigh liveweight record will be treated as the reference label for model training. However, the dataset still requires quality assurance. Swinburne will define rules for accepting or rejecting observations, including:</w:t>
       </w:r>
     </w:p>
     <w:p>
@@ -1178,7 +1178,7 @@
         <w:spacing w:after="80" w:before="0"/>
       </w:pPr>
       <w:r>
-        <w:t>The model will be developed iteratively. Model accuracy will be reported against the available Agscent Air/Optiweigh reference liveweight data, whose expected accuracy has been advised as approximately 95-97%. If independent yard-scale validation data is available, it can be used to separately assess the combined uncertainty of the weighing reference and vision model.</w:t>
+        <w:t>The model will be developed iteratively. Model accuracy will be reported against the available Optiweigh reference liveweight data, whose expected accuracy has been advised as approximately 95-97%. If independent yard-scale validation data is available, it can be used to separately assess the combined uncertainty of the weighing reference and vision model.</w:t>
       </w:r>
     </w:p>
     <w:p>
@@ -1353,7 +1353,7 @@
         <w:spacing w:after="80" w:before="0"/>
       </w:pPr>
       <w:r>
-        <w:t>The project will first establish a measurement framework, then set formal numerical targets after Batch 1 data is available and the first baseline model has been evaluated. Targets will be defined relative to the Agscent Air/Optiweigh liveweight reference used for training and evaluation. Since DIT AgTech has advised the weighing reference accuracy is approximately 95-97%, the model's measured accuracy should be interpreted within that reference uncertainty.</w:t>
+        <w:t>The project will first establish a measurement framework, then set formal numerical targets after Batch 1 data is available and the first baseline model has been evaluated. Targets will be defined relative to the Optiweigh liveweight reference used for training and evaluation. Since DIT AgTech has advised the weighing reference accuracy is approximately 95-97%, the model's measured accuracy should be interpreted within that reference uncertainty.</w:t>
       </w:r>
     </w:p>
     <w:tbl>
@@ -2042,7 +2042,7 @@
         <w:spacing w:after="30" w:before="0"/>
       </w:pPr>
       <w:r>
-        <w:t>Synchronisation requirements for camera data, animal ID, station event logs, and Agscent Air/Optiweigh liveweight records defined.</w:t>
+        <w:t>Synchronisation requirements for camera data, animal ID, station event logs, and Optiweigh liveweight records defined.</w:t>
       </w:r>
     </w:p>
     <w:p>
@@ -2662,7 +2662,7 @@
                 <w:rFonts w:ascii="Aptos" w:hAnsi="Aptos"/>
                 <w:sz w:val="17"/>
               </w:rPr>
-              <w:t>Report model accuracy relative to Agscent Air/Optiweigh reference data; document the advised 95-97% reference accuracy; use independent yard-scale validation if available.</w:t>
+              <w:t>Report model accuracy relative to Optiweigh reference data; document the advised 95-97% reference accuracy; use independent yard-scale validation if available.</w:t>
             </w:r>
           </w:p>
         </w:tc>
@@ -3848,7 +3848,7 @@
         <w:spacing w:after="30" w:before="0"/>
       </w:pPr>
       <w:r>
-        <w:t>Operation of the Agscent Air/Optiweigh or other confirmed weighing reference system.</w:t>
+        <w:t>Operation of the Optiweigh or other confirmed weighing reference system.</w:t>
       </w:r>
     </w:p>
     <w:p>

</xml_diff>